<commit_message>
Add PythonAnywhere deployment evidence
</commit_message>
<xml_diff>
--- a/모바일웹서비스 프로젝트_공통평가 01_수행 결과 보고서_완료본.docx
+++ b/모바일웹서비스 프로젝트_공통평가 01_수행 결과 보고서_완료본.docx
@@ -3715,13 +3715,8 @@
             <w:vAlign w:val="center"/>
           </w:tcPr>
           <w:p>
-            <w:pPr>
-              <w:rPr>
-                <w:rFonts w:hint="eastAsia"/>
-              </w:rPr>
-            </w:pPr>
             <w:r>
-              <w:t>△</w:t>
+              <w:t>○</w:t>
             </w:r>
           </w:p>
         </w:tc>
@@ -3731,13 +3726,8 @@
             <w:vAlign w:val="center"/>
           </w:tcPr>
           <w:p>
-            <w:pPr>
-              <w:rPr>
-                <w:rFonts w:hint="eastAsia"/>
-              </w:rPr>
-            </w:pPr>
             <w:r>
-              <w:t>△</w:t>
+              <w:t>○</w:t>
             </w:r>
           </w:p>
         </w:tc>
@@ -3747,13 +3737,8 @@
             <w:vAlign w:val="center"/>
           </w:tcPr>
           <w:p>
-            <w:pPr>
-              <w:rPr>
-                <w:rFonts w:hint="eastAsia"/>
-              </w:rPr>
-            </w:pPr>
             <w:r>
-              <w:t>PythonAnywhere 배포 및 클라우드 브라우저 캡처 필요</w:t>
+              <w:t>https://0733.pythonanywhere.com/api_root/Post/ HTTP 200 증빙 화면 첨부</w:t>
             </w:r>
           </w:p>
         </w:tc>
@@ -4937,6 +4922,72 @@
                     <a:xfrm>
                       <a:off x="0" y="0"/>
                       <a:ext cx="5303520" cy="11785600"/>
+                    </a:xfrm>
+                    <a:prstGeom prst="rect"/>
+                  </pic:spPr>
+                </pic:pic>
+              </a:graphicData>
+            </a:graphic>
+          </wp:inline>
+        </w:drawing>
+      </w:r>
+    </w:p>
+    <w:p>
+      <w:r>
+        <w:br w:type="page"/>
+      </w:r>
+    </w:p>
+    <w:p>
+      <w:pPr>
+        <w:jc w:val="center"/>
+      </w:pPr>
+      <w:r>
+        <w:rPr>
+          <w:b/>
+        </w:rPr>
+        <w:t>PythonAnywhere 클라우드 서버 동작 증빙</w:t>
+      </w:r>
+    </w:p>
+    <w:p>
+      <w:pPr>
+        <w:jc w:val="center"/>
+      </w:pPr>
+      <w:r>
+        <w:rPr>
+          <w:i/>
+        </w:rPr>
+        <w:t>GET /api_root/Post/  HTTP 200 OK</w:t>
+      </w:r>
+    </w:p>
+    <w:p>
+      <w:pPr>
+        <w:jc w:val="center"/>
+      </w:pPr>
+      <w:r>
+        <w:drawing>
+          <wp:inline xmlns:a="http://schemas.openxmlformats.org/drawingml/2006/main" xmlns:pic="http://schemas.openxmlformats.org/drawingml/2006/picture">
+            <wp:extent cx="5303520" cy="4993602"/>
+            <wp:docPr id="6" name="Picture 6"/>
+            <wp:cNvGraphicFramePr>
+              <a:graphicFrameLocks noChangeAspect="1"/>
+            </wp:cNvGraphicFramePr>
+            <a:graphic>
+              <a:graphicData uri="http://schemas.openxmlformats.org/drawingml/2006/picture">
+                <pic:pic>
+                  <pic:nvPicPr>
+                    <pic:cNvPr id="0" name="pythonanywhere-api.png"/>
+                    <pic:cNvPicPr/>
+                  </pic:nvPicPr>
+                  <pic:blipFill>
+                    <a:blip r:embed="rId19"/>
+                    <a:stretch>
+                      <a:fillRect/>
+                    </a:stretch>
+                  </pic:blipFill>
+                  <pic:spPr>
+                    <a:xfrm>
+                      <a:off x="0" y="0"/>
+                      <a:ext cx="5303520" cy="4993602"/>
                     </a:xfrm>
                     <a:prstGeom prst="rect"/>
                   </pic:spPr>

</xml_diff>

<commit_message>
Verify Android sync against cloud API
</commit_message>
<xml_diff>
--- a/모바일웹서비스 프로젝트_공통평가 01_수행 결과 보고서_완료본.docx
+++ b/모바일웹서비스 프로젝트_공통평가 01_수행 결과 보고서_완료본.docx
@@ -3904,13 +3904,8 @@
             <w:vAlign w:val="center"/>
           </w:tcPr>
           <w:p>
-            <w:pPr>
-              <w:rPr>
-                <w:rFonts w:hint="eastAsia"/>
-              </w:rPr>
-            </w:pPr>
             <w:r>
-              <w:t>△</w:t>
+              <w:t>○</w:t>
             </w:r>
           </w:p>
         </w:tc>
@@ -3920,13 +3915,8 @@
             <w:vAlign w:val="center"/>
           </w:tcPr>
           <w:p>
-            <w:pPr>
-              <w:rPr>
-                <w:rFonts w:hint="eastAsia"/>
-              </w:rPr>
-            </w:pPr>
             <w:r>
-              <w:t>△</w:t>
+              <w:t>○</w:t>
             </w:r>
           </w:p>
         </w:tc>
@@ -3936,13 +3926,8 @@
             <w:vAlign w:val="center"/>
           </w:tcPr>
           <w:p>
-            <w:pPr>
-              <w:rPr>
-                <w:rFonts w:hint="eastAsia"/>
-              </w:rPr>
-            </w:pPr>
             <w:r>
-              <w:t>PythonAnywhere 연동 Client 동기화 캡처 필요</w:t>
+              <w:t>Android Pixel_7에서 PythonAnywhere API 동기화 완료 화면 첨부</w:t>
             </w:r>
           </w:p>
         </w:tc>
@@ -4988,6 +4973,72 @@
                     <a:xfrm>
                       <a:off x="0" y="0"/>
                       <a:ext cx="5303520" cy="4993602"/>
+                    </a:xfrm>
+                    <a:prstGeom prst="rect"/>
+                  </pic:spPr>
+                </pic:pic>
+              </a:graphicData>
+            </a:graphic>
+          </wp:inline>
+        </w:drawing>
+      </w:r>
+    </w:p>
+    <w:p>
+      <w:r>
+        <w:br w:type="page"/>
+      </w:r>
+    </w:p>
+    <w:p>
+      <w:pPr>
+        <w:jc w:val="center"/>
+      </w:pPr>
+      <w:r>
+        <w:rPr>
+          <w:b/>
+        </w:rPr>
+        <w:t>PythonAnywhere 클라우드 Client 동기화 완료 증빙</w:t>
+      </w:r>
+    </w:p>
+    <w:p>
+      <w:pPr>
+        <w:jc w:val="center"/>
+      </w:pPr>
+      <w:r>
+        <w:rPr>
+          <w:i/>
+        </w:rPr>
+        <w:t>Android Pixel_7 · 동기화 완료 · 0개 게시글</w:t>
+      </w:r>
+    </w:p>
+    <w:p>
+      <w:pPr>
+        <w:jc w:val="center"/>
+      </w:pPr>
+      <w:r>
+        <w:drawing>
+          <wp:inline xmlns:a="http://schemas.openxmlformats.org/drawingml/2006/main" xmlns:pic="http://schemas.openxmlformats.org/drawingml/2006/picture">
+            <wp:extent cx="3931920" cy="8737600"/>
+            <wp:docPr id="7" name="Picture 7"/>
+            <wp:cNvGraphicFramePr>
+              <a:graphicFrameLocks noChangeAspect="1"/>
+            </wp:cNvGraphicFramePr>
+            <a:graphic>
+              <a:graphicData uri="http://schemas.openxmlformats.org/drawingml/2006/picture">
+                <pic:pic>
+                  <pic:nvPicPr>
+                    <pic:cNvPr id="0" name="android-cloud-sync.png"/>
+                    <pic:cNvPicPr/>
+                  </pic:nvPicPr>
+                  <pic:blipFill>
+                    <a:blip r:embed="rId20"/>
+                    <a:stretch>
+                      <a:fillRect/>
+                    </a:stretch>
+                  </pic:blipFill>
+                  <pic:spPr>
+                    <a:xfrm>
+                      <a:off x="0" y="0"/>
+                      <a:ext cx="3931920" cy="8737600"/>
                     </a:xfrm>
                     <a:prstGeom prst="rect"/>
                   </pic:spPr>

</xml_diff>